<commit_message>
Update project documentation and scripts
</commit_message>
<xml_diff>
--- a/report.docx
+++ b/report.docx
@@ -4,26 +4,151 @@
   <w:body>
     <w:p>
       <w:pPr>
-        <w:pStyle w:val="Title"/>
+        <w:pStyle w:val="Heading1"/>
       </w:pPr>
       <w:r>
-        <w:t>Report: Process 2 Enterprise Partition Map Validation</w:t>
+        <w:t>Automation Report</w:t>
       </w:r>
     </w:p>
     <w:p>
       <w:r>
-        <w:t>Status: SUCCESS</w:t>
+        <w:t>Date: 2026-03-17 10:26:10</w:t>
       </w:r>
     </w:p>
     <w:p>
+      <w:pPr>
+        <w:pStyle w:val="Heading2"/>
+      </w:pPr>
       <w:r>
-        <w:t xml:space="preserve">Output: Partition State: </w:t>
-        <w:br/>
-        <w:t xml:space="preserve">Enterprise Update Distributor Status: </w:t>
-        <w:br/>
-        <w:t xml:space="preserve">Enterprise Search Federator Status: </w:t>
+        <w:t>Navigation Steps</w:t>
       </w:r>
     </w:p>
+    <w:tbl>
+      <w:tblPr>
+        <w:tblW w:type="auto" w:w="0"/>
+        <w:tblLook w:firstColumn="1" w:firstRow="1" w:lastColumn="0" w:lastRow="0" w:noHBand="0" w:noVBand="1" w:val="04A0"/>
+      </w:tblPr>
+      <w:tblGrid>
+        <w:gridCol w:w="4320"/>
+        <w:gridCol w:w="4320"/>
+      </w:tblGrid>
+      <w:tr>
+        <w:tc>
+          <w:tcPr>
+            <w:tcW w:type="dxa" w:w="4320"/>
+          </w:tcPr>
+          <w:p>
+            <w:r>
+              <w:t>Step Description</w:t>
+            </w:r>
+          </w:p>
+        </w:tc>
+        <w:tc>
+          <w:tcPr>
+            <w:tcW w:type="dxa" w:w="4320"/>
+          </w:tcPr>
+          <w:p>
+            <w:r>
+              <w:t>Screenshot</w:t>
+            </w:r>
+          </w:p>
+        </w:tc>
+      </w:tr>
+      <w:tr>
+        <w:tc>
+          <w:tcPr>
+            <w:tcW w:type="dxa" w:w="4320"/>
+          </w:tcPr>
+          <w:p>
+            <w:r>
+              <w:t>Navigated to https://otds.gi07-test.opentext.cloud/otds-admin/</w:t>
+            </w:r>
+          </w:p>
+        </w:tc>
+        <w:tc>
+          <w:tcPr>
+            <w:tcW w:type="dxa" w:w="4320"/>
+          </w:tcPr>
+          <w:p>
+            <w:r>
+              <w:t>Screenshot failed: '_Cell' object has no attribute 'add_picture'</w:t>
+            </w:r>
+          </w:p>
+        </w:tc>
+      </w:tr>
+      <w:tr>
+        <w:tc>
+          <w:tcPr>
+            <w:tcW w:type="dxa" w:w="4320"/>
+          </w:tcPr>
+          <w:p>
+            <w:r>
+              <w:t>Filled username and password</w:t>
+            </w:r>
+          </w:p>
+        </w:tc>
+        <w:tc>
+          <w:tcPr>
+            <w:tcW w:type="dxa" w:w="4320"/>
+          </w:tcPr>
+          <w:p>
+            <w:r>
+              <w:t>Screenshot failed: '_Cell' object has no attribute 'add_picture'</w:t>
+            </w:r>
+          </w:p>
+        </w:tc>
+      </w:tr>
+      <w:tr>
+        <w:tc>
+          <w:tcPr>
+            <w:tcW w:type="dxa" w:w="4320"/>
+          </w:tcPr>
+          <w:p>
+            <w:r>
+              <w:t>Clicked Sign In button</w:t>
+            </w:r>
+          </w:p>
+        </w:tc>
+        <w:tc>
+          <w:tcPr>
+            <w:tcW w:type="dxa" w:w="4320"/>
+          </w:tcPr>
+          <w:p>
+            <w:r>
+              <w:t>Screenshot failed: '_Cell' object has no attribute 'add_picture'</w:t>
+            </w:r>
+          </w:p>
+        </w:tc>
+      </w:tr>
+      <w:tr>
+        <w:tc>
+          <w:tcPr>
+            <w:tcW w:type="dxa" w:w="4320"/>
+          </w:tcPr>
+          <w:p>
+            <w:r>
+              <w:t>Error: Timeout 30000ms exceeded.</w:t>
+              <w:br/>
+              <w:t>=========================== logs ===========================</w:t>
+              <w:br/>
+              <w:t>waiting for navigation to "&lt;function ImplToApiMapping.wrap_handler.&lt;locals&gt;.wrapper_func at 0x0000019929B185E0&gt;" until 'load'</w:t>
+              <w:br/>
+              <w:t>============================================================</w:t>
+            </w:r>
+          </w:p>
+        </w:tc>
+        <w:tc>
+          <w:tcPr>
+            <w:tcW w:type="dxa" w:w="4320"/>
+          </w:tcPr>
+          <w:p>
+            <w:r>
+              <w:t>Screenshot failed: '_Cell' object has no attribute 'add_picture'</w:t>
+            </w:r>
+          </w:p>
+        </w:tc>
+      </w:tr>
+    </w:tbl>
     <w:sectPr>
       <w:pgSz w:w="12240" w:h="15840"/>
       <w:pgMar w:top="1440" w:right="1800" w:bottom="1440" w:left="1800" w:header="720" w:footer="720" w:gutter="0"/>

</xml_diff>